<commit_message>
docs(education): ubicar el Laboratorio IA 01 en el tercer corte
El instrumento ABET registra "Tercer Corte" y el aporte L₃, y el nombre del
archivo de entrega pasa de C2_LIA01_... a C3_LIA01_... en el instrumento, la
guía y el README de la plantilla. Se regeneran ambos Word.

Co-Authored-By: Claude Opus 5.5 <noreply@anthropic.com>
Claude-Session: https://claude.ai/code/session_01A4jArrxa1RLtDdQTQFnPXP
</commit_message>
<xml_diff>
--- a/education/evidencias_abet/INSTRUMENTO_ABET_LAB_IA_01_EMBODIED_AI_GEMINI_ER2.docx
+++ b/education/evidencias_abet/INSTRUMENTO_ABET_LAB_IA_01_EMBODIED_AI_GEMINI_ER2.docx
@@ -282,7 +282,7 @@
                 <w:b w:val="0"/>
                 <w:sz w:val="15"/>
               </w:rPr>
-              <w:t>Segundo Corte / Laboratorios y evidencias experimentales</w:t>
+              <w:t>Tercer Corte / Laboratorios y evidencias experimentales</w:t>
             </w:r>
           </w:p>
         </w:tc>
@@ -605,7 +605,7 @@
                 <w:b w:val="0"/>
                 <w:sz w:val="15"/>
               </w:rPr>
-              <w:t>C2_LIA01_G&lt;grupo&gt;_&lt;codigo1&gt;_&lt;codigo2&gt;_v1.docx</w:t>
+              <w:t>C3_LIA01_G&lt;grupo&gt;_&lt;codigo1&gt;_&lt;codigo2&gt;_v1.docx</w:t>
             </w:r>
           </w:p>
         </w:tc>
@@ -13002,7 +13002,7 @@
         </w:rPr>
         <w:t>Nota Académica sobre 5,0 = Nota Consolidada sobre 500 ÷ 100</w:t>
         <w:br/>
-        <w:t>Aporte a Laboratorios del Corte: L = Nota Académica sobre 5,0</w:t>
+        <w:t>Aporte a Laboratorios del Tercer Corte: L₃ = Nota Académica sobre 5,0</w:t>
       </w:r>
     </w:p>
     <w:tbl>

</xml_diff>